<commit_message>
10 Kasım: 1. panoda yıl kartları 1881 ve 193∞ olarak düzeltildi; 2. pano örneği Duran Saat eklendi
Co-Authored-By: Claude Opus 5.5 <noreply@anthropic.com>
Claude-Session: https://claude.ai/code/session_013rJve14Cyk1wDaznnSyQms
</commit_message>
<xml_diff>
--- a/pano-10kasim-anma-yazilari.docx
+++ b/pano-10kasim-anma-yazilari.docx
@@ -4,12 +4,12 @@
   <w:body>
     <w:p>
       <w:pPr>
-        <w:spacing w:before="0" w:after="0" w:line="240" w:lineRule="auto"/>
+        <w:spacing w:before="0" w:after="0"/>
       </w:pPr>
       <w:r>
         <w:drawing>
           <wp:inline xmlns:a="http://schemas.openxmlformats.org/drawingml/2006/main" xmlns:pic="http://schemas.openxmlformats.org/drawingml/2006/picture">
-            <wp:extent cx="7560000" cy="10692000"/>
+            <wp:extent cx="7542000" cy="10659684"/>
             <wp:docPr id="1" name="Picture 1"/>
             <wp:cNvGraphicFramePr>
               <a:graphicFrameLocks noChangeAspect="1"/>
@@ -18,7 +18,7 @@
               <a:graphicData uri="http://schemas.openxmlformats.org/drawingml/2006/picture">
                 <pic:pic>
                   <pic:nvPicPr>
-                    <pic:cNvPr id="0" name="image.jpg"/>
+                    <pic:cNvPr id="0" name="p-1.jpg"/>
                     <pic:cNvPicPr/>
                   </pic:nvPicPr>
                   <pic:blipFill>
@@ -30,7 +30,7 @@
                   <pic:spPr>
                     <a:xfrm>
                       <a:off x="0" y="0"/>
-                      <a:ext cx="7560000" cy="10692000"/>
+                      <a:ext cx="7542000" cy="10659684"/>
                     </a:xfrm>
                     <a:prstGeom prst="rect"/>
                   </pic:spPr>
@@ -53,12 +53,12 @@
     </w:p>
     <w:p>
       <w:pPr>
-        <w:spacing w:before="0" w:after="0" w:line="240" w:lineRule="auto"/>
+        <w:spacing w:before="0" w:after="0"/>
       </w:pPr>
       <w:r>
         <w:drawing>
           <wp:inline xmlns:a="http://schemas.openxmlformats.org/drawingml/2006/main" xmlns:pic="http://schemas.openxmlformats.org/drawingml/2006/picture">
-            <wp:extent cx="7560000" cy="10692000"/>
+            <wp:extent cx="7542000" cy="10659684"/>
             <wp:docPr id="2" name="Picture 2"/>
             <wp:cNvGraphicFramePr>
               <a:graphicFrameLocks noChangeAspect="1"/>
@@ -67,7 +67,7 @@
               <a:graphicData uri="http://schemas.openxmlformats.org/drawingml/2006/picture">
                 <pic:pic>
                   <pic:nvPicPr>
-                    <pic:cNvPr id="0" name="image.jpg"/>
+                    <pic:cNvPr id="0" name="p-2.jpg"/>
                     <pic:cNvPicPr/>
                   </pic:nvPicPr>
                   <pic:blipFill>
@@ -79,7 +79,7 @@
                   <pic:spPr>
                     <a:xfrm>
                       <a:off x="0" y="0"/>
-                      <a:ext cx="7560000" cy="10692000"/>
+                      <a:ext cx="7542000" cy="10659684"/>
                     </a:xfrm>
                     <a:prstGeom prst="rect"/>
                   </pic:spPr>
@@ -102,12 +102,12 @@
     </w:p>
     <w:p>
       <w:pPr>
-        <w:spacing w:before="0" w:after="0" w:line="240" w:lineRule="auto"/>
+        <w:spacing w:before="0" w:after="0"/>
       </w:pPr>
       <w:r>
         <w:drawing>
           <wp:inline xmlns:a="http://schemas.openxmlformats.org/drawingml/2006/main" xmlns:pic="http://schemas.openxmlformats.org/drawingml/2006/picture">
-            <wp:extent cx="7560000" cy="10692000"/>
+            <wp:extent cx="7542000" cy="10659684"/>
             <wp:docPr id="3" name="Picture 3"/>
             <wp:cNvGraphicFramePr>
               <a:graphicFrameLocks noChangeAspect="1"/>
@@ -116,7 +116,7 @@
               <a:graphicData uri="http://schemas.openxmlformats.org/drawingml/2006/picture">
                 <pic:pic>
                   <pic:nvPicPr>
-                    <pic:cNvPr id="0" name="image.jpg"/>
+                    <pic:cNvPr id="0" name="p-3.jpg"/>
                     <pic:cNvPicPr/>
                   </pic:nvPicPr>
                   <pic:blipFill>
@@ -128,7 +128,7 @@
                   <pic:spPr>
                     <a:xfrm>
                       <a:off x="0" y="0"/>
-                      <a:ext cx="7560000" cy="10692000"/>
+                      <a:ext cx="7542000" cy="10659684"/>
                     </a:xfrm>
                     <a:prstGeom prst="rect"/>
                   </pic:spPr>
@@ -151,12 +151,12 @@
     </w:p>
     <w:p>
       <w:pPr>
-        <w:spacing w:before="0" w:after="0" w:line="240" w:lineRule="auto"/>
+        <w:spacing w:before="0" w:after="0"/>
       </w:pPr>
       <w:r>
         <w:drawing>
           <wp:inline xmlns:a="http://schemas.openxmlformats.org/drawingml/2006/main" xmlns:pic="http://schemas.openxmlformats.org/drawingml/2006/picture">
-            <wp:extent cx="10692000" cy="7560000"/>
+            <wp:extent cx="10674000" cy="7552129"/>
             <wp:docPr id="4" name="Picture 4"/>
             <wp:cNvGraphicFramePr>
               <a:graphicFrameLocks noChangeAspect="1"/>
@@ -165,7 +165,7 @@
               <a:graphicData uri="http://schemas.openxmlformats.org/drawingml/2006/picture">
                 <pic:pic>
                   <pic:nvPicPr>
-                    <pic:cNvPr id="0" name="image.jpg"/>
+                    <pic:cNvPr id="0" name="p-4.jpg"/>
                     <pic:cNvPicPr/>
                   </pic:nvPicPr>
                   <pic:blipFill>
@@ -177,7 +177,7 @@
                   <pic:spPr>
                     <a:xfrm>
                       <a:off x="0" y="0"/>
-                      <a:ext cx="10692000" cy="7560000"/>
+                      <a:ext cx="10674000" cy="7552129"/>
                     </a:xfrm>
                     <a:prstGeom prst="rect"/>
                   </pic:spPr>
@@ -200,12 +200,12 @@
     </w:p>
     <w:p>
       <w:pPr>
-        <w:spacing w:before="0" w:after="0" w:line="240" w:lineRule="auto"/>
+        <w:spacing w:before="0" w:after="0"/>
       </w:pPr>
       <w:r>
         <w:drawing>
           <wp:inline xmlns:a="http://schemas.openxmlformats.org/drawingml/2006/main" xmlns:pic="http://schemas.openxmlformats.org/drawingml/2006/picture">
-            <wp:extent cx="10692000" cy="7560000"/>
+            <wp:extent cx="10674000" cy="7552129"/>
             <wp:docPr id="5" name="Picture 5"/>
             <wp:cNvGraphicFramePr>
               <a:graphicFrameLocks noChangeAspect="1"/>
@@ -214,7 +214,7 @@
               <a:graphicData uri="http://schemas.openxmlformats.org/drawingml/2006/picture">
                 <pic:pic>
                   <pic:nvPicPr>
-                    <pic:cNvPr id="0" name="image.jpg"/>
+                    <pic:cNvPr id="0" name="p-5.jpg"/>
                     <pic:cNvPicPr/>
                   </pic:nvPicPr>
                   <pic:blipFill>
@@ -226,7 +226,7 @@
                   <pic:spPr>
                     <a:xfrm>
                       <a:off x="0" y="0"/>
-                      <a:ext cx="10692000" cy="7560000"/>
+                      <a:ext cx="10674000" cy="7552129"/>
                     </a:xfrm>
                     <a:prstGeom prst="rect"/>
                   </pic:spPr>
@@ -249,12 +249,12 @@
     </w:p>
     <w:p>
       <w:pPr>
-        <w:spacing w:before="0" w:after="0" w:line="240" w:lineRule="auto"/>
+        <w:spacing w:before="0" w:after="0"/>
       </w:pPr>
       <w:r>
         <w:drawing>
           <wp:inline xmlns:a="http://schemas.openxmlformats.org/drawingml/2006/main" xmlns:pic="http://schemas.openxmlformats.org/drawingml/2006/picture">
-            <wp:extent cx="7560000" cy="10692000"/>
+            <wp:extent cx="7542000" cy="10659684"/>
             <wp:docPr id="6" name="Picture 6"/>
             <wp:cNvGraphicFramePr>
               <a:graphicFrameLocks noChangeAspect="1"/>
@@ -263,7 +263,7 @@
               <a:graphicData uri="http://schemas.openxmlformats.org/drawingml/2006/picture">
                 <pic:pic>
                   <pic:nvPicPr>
-                    <pic:cNvPr id="0" name="image.jpg"/>
+                    <pic:cNvPr id="0" name="p-6.jpg"/>
                     <pic:cNvPicPr/>
                   </pic:nvPicPr>
                   <pic:blipFill>
@@ -275,7 +275,7 @@
                   <pic:spPr>
                     <a:xfrm>
                       <a:off x="0" y="0"/>
-                      <a:ext cx="7560000" cy="10692000"/>
+                      <a:ext cx="7542000" cy="10659684"/>
                     </a:xfrm>
                     <a:prstGeom prst="rect"/>
                   </pic:spPr>

</xml_diff>